<commit_message>
feat: implement targeted resume generation with DOCX and PDF outputs
</commit_message>
<xml_diff>
--- a/resources/resume/2026 targeted resume template.docx
+++ b/resources/resume/2026 targeted resume template.docx
@@ -3,12 +3,311 @@
 <w:document xmlns:wpc="http://schemas.microsoft.com/office/word/2010/wordprocessingCanvas" xmlns:cx="http://schemas.microsoft.com/office/drawing/2014/chartex" xmlns:cx1="http://schemas.microsoft.com/office/drawing/2015/9/8/chartex" xmlns:cx2="http://schemas.microsoft.com/office/drawing/2015/10/21/chartex" xmlns:cx3="http://schemas.microsoft.com/office/drawing/2016/5/9/chartex" xmlns:cx4="http://schemas.microsoft.com/office/drawing/2016/5/10/chartex" xmlns:cx5="http://schemas.microsoft.com/office/drawing/2016/5/11/chartex" xmlns:cx6="http://schemas.microsoft.com/office/drawing/2016/5/12/chartex" xmlns:cx7="http://schemas.microsoft.com/office/drawing/2016/5/13/chartex" xmlns:cx8="http://schemas.microsoft.com/office/drawing/2016/5/14/chartex" xmlns:mc="http://schemas.openxmlformats.org/markup-compatibility/2006" xmlns:aink="http://schemas.microsoft.com/office/drawing/2016/ink" xmlns:am3d="http://schemas.microsoft.com/office/drawing/2017/model3d" xmlns:o="urn:schemas-microsoft-com:office:office" xmlns:oel="http://schemas.microsoft.com/office/2019/extlst" xmlns:r="http://schemas.openxmlformats.org/officeDocument/2006/relationships" xmlns:m="http://schemas.openxmlformats.org/officeDocument/2006/math" xmlns:v="urn:schemas-microsoft-com:vml" xmlns:wp14="http://schemas.microsoft.com/office/word/2010/wordprocessingDrawing" xmlns:wp="http://schemas.openxmlformats.org/drawingml/2006/wordprocessingDrawing" xmlns:w10="urn:schemas-microsoft-com:office:word" xmlns:w="http://schemas.openxmlformats.org/wordprocessingml/2006/main" xmlns:w14="http://schemas.microsoft.com/office/word/2010/wordml" xmlns:w15="http://schemas.microsoft.com/office/word/2012/wordml" xmlns:w16cex="http://schemas.microsoft.com/office/word/2018/wordml/cex" xmlns:w16cid="http://schemas.microsoft.com/office/word/2016/wordml/cid" xmlns:w16="http://schemas.microsoft.com/office/word/2018/wordml" xmlns:w16du="http://schemas.microsoft.com/office/word/2023/wordml/word16du" xmlns:w16sdtdh="http://schemas.microsoft.com/office/word/2020/wordml/sdtdatahash" xmlns:w16sdtfl="http://schemas.microsoft.com/office/word/2024/wordml/sdtformatlock" xmlns:w16se="http://schemas.microsoft.com/office/word/2015/wordml/symex" xmlns:wpg="http://schemas.microsoft.com/office/word/2010/wordprocessingGroup" xmlns:wpi="http://schemas.microsoft.com/office/word/2010/wordprocessingInk" xmlns:wne="http://schemas.microsoft.com/office/word/2006/wordml" xmlns:wps="http://schemas.microsoft.com/office/word/2010/wordprocessingShape" mc:Ignorable="w14 w15 w16se w16cid w16 w16cex w16sdtdh w16sdtfl w16du wp14">
   <w:body>
     <w:p>
+      <w:bookmarkStart w:id="0" w:name="_Hlk211971945"/>
+    </w:p>
+    <w:p>
+      <w:r>
+        <w:rPr>
+          <w:noProof/>
+          <w:color w:val="FFFFFF" w:themeColor="background1"/>
+        </w:rPr>
+        <mc:AlternateContent>
+          <mc:Choice Requires="wps">
+            <w:drawing>
+              <wp:anchor distT="0" distB="0" distL="114300" distR="114300" simplePos="0" relativeHeight="251659264" behindDoc="1" locked="0" layoutInCell="1" allowOverlap="1" wp14:anchorId="4A187B5F" wp14:editId="25E14134">
+                <wp:simplePos x="0" y="0"/>
+                <wp:positionH relativeFrom="page">
+                  <wp:posOffset>-133350</wp:posOffset>
+                </wp:positionH>
+                <wp:positionV relativeFrom="page">
+                  <wp:posOffset>12700</wp:posOffset>
+                </wp:positionV>
+                <wp:extent cx="7799832" cy="654050"/>
+                <wp:effectExtent l="0" t="0" r="10795" b="12700"/>
+                <wp:wrapNone/>
+                <wp:docPr id="1183410925" name="Rectangle 1">
+                  <a:extLst xmlns:a="http://schemas.openxmlformats.org/drawingml/2006/main">
+                    <a:ext uri="{C183D7F6-B498-43B3-948B-1728B52AA6E4}">
+                      <adec:decorative xmlns:adec="http://schemas.microsoft.com/office/drawing/2017/decorative" val="1"/>
+                    </a:ext>
+                  </a:extLst>
+                </wp:docPr>
+                <wp:cNvGraphicFramePr/>
+                <a:graphic xmlns:a="http://schemas.openxmlformats.org/drawingml/2006/main">
+                  <a:graphicData uri="http://schemas.microsoft.com/office/word/2010/wordprocessingShape">
+                    <wps:wsp>
+                      <wps:cNvSpPr/>
+                      <wps:spPr>
+                        <a:xfrm>
+                          <a:off x="0" y="0"/>
+                          <a:ext cx="7799832" cy="654050"/>
+                        </a:xfrm>
+                        <a:prstGeom prst="rect">
+                          <a:avLst/>
+                        </a:prstGeom>
+                        <a:solidFill>
+                          <a:srgbClr val="1B587C"/>
+                        </a:solidFill>
+                        <a:ln>
+                          <a:solidFill>
+                            <a:srgbClr val="1B587C"/>
+                          </a:solidFill>
+                        </a:ln>
+                      </wps:spPr>
+                      <wps:style>
+                        <a:lnRef idx="2">
+                          <a:schemeClr val="accent1">
+                            <a:shade val="15000"/>
+                          </a:schemeClr>
+                        </a:lnRef>
+                        <a:fillRef idx="1">
+                          <a:schemeClr val="accent1"/>
+                        </a:fillRef>
+                        <a:effectRef idx="0">
+                          <a:schemeClr val="accent1"/>
+                        </a:effectRef>
+                        <a:fontRef idx="minor">
+                          <a:schemeClr val="lt1"/>
+                        </a:fontRef>
+                      </wps:style>
+                      <wps:txbx>
+                        <w:txbxContent>
+                          <w:p>
+                            <w:pPr>
+                              <w:pStyle w:val="Title"/>
+                              <w:rPr>
+                                <w:caps/>
+                                <w:color w:val="FFFFFF" w:themeColor="background1"/>
+                              </w:rPr>
+                            </w:pPr>
+                            <w:r>
+                              <w:rPr>
+                                <w:caps/>
+                                <w:color w:val="FFFFFF" w:themeColor="background1"/>
+                              </w:rPr>
+                              <w:t>{name}</w:t>
+                            </w:r>
+                          </w:p>
+                          <w:p>
+                            <w:pPr>
+                              <w:spacing w:after="240"/>
+                              <w:jc w:val="center"/>
+                              <w:rPr>
+                                <w:color w:val="FFFFFF" w:themeColor="background1"/>
+                                <w:sz w:val="22"/>
+                              </w:rPr>
+                            </w:pPr>
+                            <w:r>
+                              <w:rPr>
+                                <w:color w:val="FFFFFF" w:themeColor="background1"/>
+                                <w:sz w:val="22"/>
+                              </w:rPr>
+                              <w:t>{title}</w:t>
+                            </w:r>
+                            <w:r>
+                              <w:rPr>
+                                <w:color w:val="FFFFFF" w:themeColor="background1"/>
+                                <w:sz w:val="22"/>
+                              </w:rPr>
+                              <w:t xml:space="preserve"> • </w:t>
+                            </w:r>
+                            <w:hyperlink r:id="rId8" w:history="1">
+                              <w:r>
+                                <w:rPr>
+                                  <w:rStyle w:val="Hyperlink"/>
+                                  <w:color w:val="FFFFFF" w:themeColor="background1"/>
+                                  <w:sz w:val="22"/>
+                                  <w:u w:val="none"/>
+                                </w:rPr>
+                                <w:t>{email}</w:t>
+                              </w:r>
+                            </w:hyperlink>
+                            <w:r>
+                              <w:rPr>
+                                <w:color w:val="FFFFFF" w:themeColor="background1"/>
+                                <w:sz w:val="22"/>
+                              </w:rPr>
+                              <w:t xml:space="preserve"> • </w:t>
+                            </w:r>
+                            <w:hyperlink r:id="rId9" w:history="1">
+                              <w:r>
+                                <w:rPr>
+                                  <w:rStyle w:val="Hyperlink"/>
+                                  <w:color w:val="FFFFFF" w:themeColor="background1"/>
+                                  <w:sz w:val="22"/>
+                                  <w:u w:val="none"/>
+                                </w:rPr>
+                                <w:t>{phone}</w:t>
+                              </w:r>
+                            </w:hyperlink>
+                            <w:r>
+                              <w:rPr>
+                                <w:color w:val="FFFFFF" w:themeColor="background1"/>
+                                <w:sz w:val="22"/>
+                              </w:rPr>
+                              <w:t xml:space="preserve"> • </w:t>
+                            </w:r>
+                            <w:hyperlink r:id="rId10" w:history="1">
+                              <w:r>
+                                <w:rPr>
+                                  <w:rStyle w:val="Hyperlink"/>
+                                  <w:color w:val="FFFFFF" w:themeColor="background1"/>
+                                  <w:sz w:val="22"/>
+                                  <w:u w:val="none"/>
+                                </w:rPr>
+                                <w:t>linkedin.com/in/</w:t>
+                              </w:r>
+                              <w:proofErr w:type="spellStart"/>
+                              <w:r>
+                                <w:rPr>
+                                  <w:rStyle w:val="Hyperlink"/>
+                                  <w:color w:val="FFFFFF" w:themeColor="background1"/>
+                                  <w:sz w:val="22"/>
+                                  <w:u w:val="none"/>
+                                </w:rPr>
+                                <w:t>jasonvertucio</w:t>
+                              </w:r>
+                              <w:proofErr w:type="spellEnd"/>
+                            </w:hyperlink>
+                          </w:p>
+                        </w:txbxContent>
+                      </wps:txbx>
+                      <wps:bodyPr rot="0" spcFirstLastPara="0" vertOverflow="overflow" horzOverflow="overflow" vert="horz" wrap="square" lIns="91440" tIns="45720" rIns="91440" bIns="45720" numCol="1" spcCol="0" rtlCol="0" fromWordArt="0" anchor="ctr" anchorCtr="0" forceAA="0" compatLnSpc="1">
+                        <a:prstTxWarp prst="textNoShape">
+                          <a:avLst/>
+                        </a:prstTxWarp>
+                        <a:noAutofit/>
+                      </wps:bodyPr>
+                    </wps:wsp>
+                  </a:graphicData>
+                </a:graphic>
+                <wp14:sizeRelH relativeFrom="margin">
+                  <wp14:pctWidth>0</wp14:pctWidth>
+                </wp14:sizeRelH>
+                <wp14:sizeRelV relativeFrom="margin">
+                  <wp14:pctHeight>0</wp14:pctHeight>
+                </wp14:sizeRelV>
+              </wp:anchor>
+            </w:drawing>
+          </mc:Choice>
+          <mc:Fallback>
+            <w:pict>
+              <v:rect w14:anchorId="4A187B5F" id="Rectangle 1" o:spid="_x0000_s1026" alt="&quot;&quot;" style="position:absolute;margin-left:-10.5pt;margin-top:1pt;width:614.15pt;height:51.5pt;z-index:-251657216;visibility:visible;mso-wrap-style:square;mso-width-percent:0;mso-height-percent:0;mso-wrap-distance-left:9pt;mso-wrap-distance-top:0;mso-wrap-distance-right:9pt;mso-wrap-distance-bottom:0;mso-position-horizontal:absolute;mso-position-horizontal-relative:page;mso-position-vertical:absolute;mso-position-vertical-relative:page;mso-width-percent:0;mso-height-percent:0;mso-width-relative:margin;mso-height-relative:margin;v-text-anchor:middle" o:gfxdata="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" fillcolor="#1b587c" strokecolor="#1b587c" strokeweight="1.5pt">
+                <v:textbox>
+                  <w:txbxContent>
+                    <w:p>
+                      <w:pPr>
+                        <w:pStyle w:val="Title"/>
+                        <w:rPr>
+                          <w:caps/>
+                          <w:color w:val="FFFFFF" w:themeColor="background1"/>
+                        </w:rPr>
+                      </w:pPr>
+                      <w:r>
+                        <w:rPr>
+                          <w:caps/>
+                          <w:color w:val="FFFFFF" w:themeColor="background1"/>
+                        </w:rPr>
+                        <w:t>{name}</w:t>
+                      </w:r>
+                    </w:p>
+                    <w:p>
+                      <w:pPr>
+                        <w:spacing w:after="240"/>
+                        <w:jc w:val="center"/>
+                        <w:rPr>
+                          <w:color w:val="FFFFFF" w:themeColor="background1"/>
+                          <w:sz w:val="22"/>
+                        </w:rPr>
+                      </w:pPr>
+                      <w:r>
+                        <w:rPr>
+                          <w:color w:val="FFFFFF" w:themeColor="background1"/>
+                          <w:sz w:val="22"/>
+                        </w:rPr>
+                        <w:t>{title}</w:t>
+                      </w:r>
+                      <w:r>
+                        <w:rPr>
+                          <w:color w:val="FFFFFF" w:themeColor="background1"/>
+                          <w:sz w:val="22"/>
+                        </w:rPr>
+                        <w:t xml:space="preserve"> • </w:t>
+                      </w:r>
+                      <w:hyperlink r:id="rId11" w:history="1">
+                        <w:r>
+                          <w:rPr>
+                            <w:rStyle w:val="Hyperlink"/>
+                            <w:color w:val="FFFFFF" w:themeColor="background1"/>
+                            <w:sz w:val="22"/>
+                            <w:u w:val="none"/>
+                          </w:rPr>
+                          <w:t>{email}</w:t>
+                        </w:r>
+                      </w:hyperlink>
+                      <w:r>
+                        <w:rPr>
+                          <w:color w:val="FFFFFF" w:themeColor="background1"/>
+                          <w:sz w:val="22"/>
+                        </w:rPr>
+                        <w:t xml:space="preserve"> • </w:t>
+                      </w:r>
+                      <w:hyperlink r:id="rId12" w:history="1">
+                        <w:r>
+                          <w:rPr>
+                            <w:rStyle w:val="Hyperlink"/>
+                            <w:color w:val="FFFFFF" w:themeColor="background1"/>
+                            <w:sz w:val="22"/>
+                            <w:u w:val="none"/>
+                          </w:rPr>
+                          <w:t>{phone}</w:t>
+                        </w:r>
+                      </w:hyperlink>
+                      <w:r>
+                        <w:rPr>
+                          <w:color w:val="FFFFFF" w:themeColor="background1"/>
+                          <w:sz w:val="22"/>
+                        </w:rPr>
+                        <w:t xml:space="preserve"> • </w:t>
+                      </w:r>
+                      <w:hyperlink r:id="rId13" w:history="1">
+                        <w:r>
+                          <w:rPr>
+                            <w:rStyle w:val="Hyperlink"/>
+                            <w:color w:val="FFFFFF" w:themeColor="background1"/>
+                            <w:sz w:val="22"/>
+                            <w:u w:val="none"/>
+                          </w:rPr>
+                          <w:t>linkedin.com/in/</w:t>
+                        </w:r>
+                        <w:proofErr w:type="spellStart"/>
+                        <w:r>
+                          <w:rPr>
+                            <w:rStyle w:val="Hyperlink"/>
+                            <w:color w:val="FFFFFF" w:themeColor="background1"/>
+                            <w:sz w:val="22"/>
+                            <w:u w:val="none"/>
+                          </w:rPr>
+                          <w:t>jasonvertucio</w:t>
+                        </w:r>
+                        <w:proofErr w:type="spellEnd"/>
+                      </w:hyperlink>
+                    </w:p>
+                  </w:txbxContent>
+                </v:textbox>
+                <w10:wrap anchorx="page" anchory="page"/>
+              </v:rect>
+            </w:pict>
+          </mc:Fallback>
+        </mc:AlternateContent>
+      </w:r>
+      <w:bookmarkEnd w:id="0"/>
       <w:r>
         <w:t>{resume}</w:t>
       </w:r>
     </w:p>
     <w:sectPr>
-      <w:headerReference w:type="default" r:id="rId8"/>
+      <w:headerReference w:type="default" r:id="rId14"/>
       <w:type w:val="continuous"/>
       <w:pgSz w:w="11906" w:h="16838"/>
       <w:pgMar w:top="1034" w:right="720" w:bottom="540" w:left="720" w:header="708" w:footer="708" w:gutter="0"/>

</xml_diff>

<commit_message>
fix(resume): trim leading newlines and simplify XML content injection
- In MarkdownToOpenXmlConverter, strip leading \r and \n to prevent blank first paragraphs.
- Improve whitespace handling in parseLines by checking for empty lines more robustly.
- Rename replaceResumeContent to appendResumeContent to reflect actual behavior.
- Simplify XML manipulation by appending parsed content directly to the body instead of searching for placeholders.
- Add debug logging for the final generated XML output.
</commit_message>
<xml_diff>
--- a/resources/resume/2026 targeted resume template.docx
+++ b/resources/resume/2026 targeted resume template.docx
@@ -2,8 +2,8 @@
 <file path=word/document.xml><?xml version="1.0" encoding="utf-8"?>
 <w:document xmlns:wpc="http://schemas.microsoft.com/office/word/2010/wordprocessingCanvas" xmlns:cx="http://schemas.microsoft.com/office/drawing/2014/chartex" xmlns:cx1="http://schemas.microsoft.com/office/drawing/2015/9/8/chartex" xmlns:cx2="http://schemas.microsoft.com/office/drawing/2015/10/21/chartex" xmlns:cx3="http://schemas.microsoft.com/office/drawing/2016/5/9/chartex" xmlns:cx4="http://schemas.microsoft.com/office/drawing/2016/5/10/chartex" xmlns:cx5="http://schemas.microsoft.com/office/drawing/2016/5/11/chartex" xmlns:cx6="http://schemas.microsoft.com/office/drawing/2016/5/12/chartex" xmlns:cx7="http://schemas.microsoft.com/office/drawing/2016/5/13/chartex" xmlns:cx8="http://schemas.microsoft.com/office/drawing/2016/5/14/chartex" xmlns:mc="http://schemas.openxmlformats.org/markup-compatibility/2006" xmlns:aink="http://schemas.microsoft.com/office/drawing/2016/ink" xmlns:am3d="http://schemas.microsoft.com/office/drawing/2017/model3d" xmlns:o="urn:schemas-microsoft-com:office:office" xmlns:oel="http://schemas.microsoft.com/office/2019/extlst" xmlns:r="http://schemas.openxmlformats.org/officeDocument/2006/relationships" xmlns:m="http://schemas.openxmlformats.org/officeDocument/2006/math" xmlns:v="urn:schemas-microsoft-com:vml" xmlns:wp14="http://schemas.microsoft.com/office/word/2010/wordprocessingDrawing" xmlns:wp="http://schemas.openxmlformats.org/drawingml/2006/wordprocessingDrawing" xmlns:w10="urn:schemas-microsoft-com:office:word" xmlns:w="http://schemas.openxmlformats.org/wordprocessingml/2006/main" xmlns:w14="http://schemas.microsoft.com/office/word/2010/wordml" xmlns:w15="http://schemas.microsoft.com/office/word/2012/wordml" xmlns:w16cex="http://schemas.microsoft.com/office/word/2018/wordml/cex" xmlns:w16cid="http://schemas.microsoft.com/office/word/2016/wordml/cid" xmlns:w16="http://schemas.microsoft.com/office/word/2018/wordml" xmlns:w16du="http://schemas.microsoft.com/office/word/2023/wordml/word16du" xmlns:w16sdtdh="http://schemas.microsoft.com/office/word/2020/wordml/sdtdatahash" xmlns:w16sdtfl="http://schemas.microsoft.com/office/word/2024/wordml/sdtformatlock" xmlns:w16se="http://schemas.microsoft.com/office/word/2015/wordml/symex" xmlns:wpg="http://schemas.microsoft.com/office/word/2010/wordprocessingGroup" xmlns:wpi="http://schemas.microsoft.com/office/word/2010/wordprocessingInk" xmlns:wne="http://schemas.microsoft.com/office/word/2006/wordml" xmlns:wps="http://schemas.microsoft.com/office/word/2010/wordprocessingShape" mc:Ignorable="w14 w15 w16se w16cid w16 w16cex w16sdtdh w16sdtfl w16du wp14">
   <w:body>
+    <w:bookmarkStart w:id="0" w:name="_Hlk211971945"/>
     <w:p>
-      <w:bookmarkStart w:id="0" w:name="_Hlk211971945"/>
       <w:r>
         <w:rPr>
           <w:noProof/>
@@ -74,14 +74,12 @@
                             <w:pPr>
                               <w:pStyle w:val="Title"/>
                               <w:rPr>
-                                <w:rFonts w:ascii="Josefin Sans" w:hAnsi="Josefin Sans"/>
                                 <w:caps/>
                                 <w:color w:val="FFFFFF" w:themeColor="background1"/>
                               </w:rPr>
                             </w:pPr>
                             <w:r>
                               <w:rPr>
-                                <w:rFonts w:ascii="Josefin Sans" w:hAnsi="Josefin Sans"/>
                                 <w:caps/>
                                 <w:color w:val="FFFFFF" w:themeColor="background1"/>
                               </w:rPr>
@@ -318,11 +316,7 @@
         </mc:AlternateContent>
       </w:r>
       <w:bookmarkEnd w:id="0"/>
-      <w:r>
-        <w:t>{resume}</w:t>
-      </w:r>
     </w:p>
-    <w:p/>
     <w:sectPr>
       <w:headerReference w:type="default" r:id="rId12"/>
       <w:type w:val="continuous"/>
@@ -1401,7 +1395,6 @@
       <w:spacing w:line="288" w:lineRule="auto"/>
     </w:pPr>
     <w:rPr>
-      <w:rFonts w:ascii="Montserrat" w:hAnsi="Montserrat"/>
       <w:sz w:val="20"/>
     </w:rPr>
   </w:style>

</xml_diff>